<commit_message>
Revamp resume to emphasize data modeling; add Spirit Airlines contract role
Rewrites the summary and reorganizes skills to lead with predictive modeling,
statistical analysis, and forecasting (new "Data Analysis & Modeling" group),
while keeping the BI/visualization and ops-leadership experience. Adds the
Spirit Airlines Aviation Data Analyst contract role (Jan 2025 - Apr 2026,
concurrent with Brink's Home Security), and adds a matching aviation-focused
project card. Regenerates the downloadable .docx resume so it matches the
site content.
</commit_message>
<xml_diff>
--- a/public/Justine_Manning_Resume.docx
+++ b/public/Justine_Manning_Resume.docx
@@ -11,11 +11,6 @@
           <w:b/>
         </w:rPr>
         <w:t>Justine Manning</w:t>
-      </w:r>
-      <w:r>
-        <w:rPr>
-          <w:b/>
-        </w:rPr>
         <w:br/>
         <w:t>Dallas, TX 75226 | (945) 391-5999 | Justmanning97@gmail.com</w:t>
       </w:r>
@@ -31,7 +26,7 @@
     </w:p>
     <w:p>
       <w:r>
-        <w:t>Data Analyst with over 8 years of experience driving operational excellence through high-impact data storytelling and technical solutioning. Recently earned the Google Data Analytics Professional Certificate, mastering advanced SQL, Python, and R to automate workflows and enhance predictive capabilities. Proven track record of reducing the "cost to serve" and increasing ROI by developing interactive BI dashboards and performing complex risk assessments for executive leadership.</w:t>
+        <w:t>Data Analyst with over 8 years of experience turning operational and industry data into predictive models and executive-ready insights. Builds statistical and predictive models (Python, R, SQL) to forecast performance trends, alongside interactive BI dashboards that translate complex datasets into clear, decision-ready visuals. Google Data Analytics Professional Certificate holder with a proven record of reducing the “cost to serve,” improving operational performance, and increasing ROI through data-driven modeling and risk assessment for executive leadership.</w:t>
       </w:r>
     </w:p>
     <w:p>
@@ -44,12 +39,17 @@
     </w:p>
     <w:p>
       <w:r>
-        <w:t>Data Analysis &amp; Visualization: SQL (MS SQL Server), Tableau, Power BI, Pivot Tables, Trend Analysis, KPI Tracking.</w:t>
+        <w:t>Data Analysis &amp; Modeling: Predictive Modeling, Regression &amp; Statistical Analysis, Forecasting &amp; Trend Analysis, SQL (MS SQL Server), Python, R.</w:t>
       </w:r>
     </w:p>
     <w:p>
       <w:r>
-        <w:t>Programming &amp; Tools: Python, R, JavaScript, Jira Service Desk, Citrix, Google Workspace, Microsoft Office.</w:t>
+        <w:t>BI &amp; Visualization: Power BI, Tableau, DAX, Pivot Tables, KPI Tracking.</w:t>
+      </w:r>
+    </w:p>
+    <w:p>
+      <w:r>
+        <w:t>Programming &amp; Tools: JavaScript, Jira Service Desk, Citrix, Google Workspace, Microsoft Office.</w:t>
       </w:r>
     </w:p>
     <w:p>
@@ -116,6 +116,59 @@
       </w:pPr>
       <w:r>
         <w:t>Present high-level project concepts using visual aids and case studies to secure stakeholder buy-in for operational changes.</w:t>
+      </w:r>
+    </w:p>
+    <w:p>
+      <w:r>
+        <w:rPr>
+          <w:b/>
+        </w:rPr>
+        <w:t>Spirit Airlines | Aviation Data Analyst (Contract)</w:t>
+      </w:r>
+    </w:p>
+    <w:p>
+      <w:r>
+        <w:t>January 2025 – April 2026 (concurrent contract engagement)</w:t>
+      </w:r>
+    </w:p>
+    <w:p>
+      <w:pPr>
+        <w:pStyle w:val="ListBullet"/>
+      </w:pPr>
+      <w:r>
+        <w:t>Built predictive models in Python and R to forecast flight delay risk and on-time performance, giving operations leadership advance visibility into schedule reliability.</w:t>
+      </w:r>
+    </w:p>
+    <w:p>
+      <w:pPr>
+        <w:pStyle w:val="ListBullet"/>
+      </w:pPr>
+      <w:r>
+        <w:t>Developed statistical models analyzing turnaround times, fuel consumption, and crew scheduling data to identify network-wide cost-saving opportunities.</w:t>
+      </w:r>
+    </w:p>
+    <w:p>
+      <w:pPr>
+        <w:pStyle w:val="ListBullet"/>
+      </w:pPr>
+      <w:r>
+        <w:t>Designed SQL-based ETL pipelines consolidating flight operations data from multiple source systems into a centralized analytics warehouse.</w:t>
+      </w:r>
+    </w:p>
+    <w:p>
+      <w:pPr>
+        <w:pStyle w:val="ListBullet"/>
+      </w:pPr>
+      <w:r>
+        <w:t>Built Power BI dashboards tracking on-time performance, load factor, and cost per available seat mile (CASM) for daily operations reviews.</w:t>
+      </w:r>
+    </w:p>
+    <w:p>
+      <w:pPr>
+        <w:pStyle w:val="ListBullet"/>
+      </w:pPr>
+      <w:r>
+        <w:t>Partnered with operations and finance stakeholders to translate model outputs into actionable route and staffing recommendations.</w:t>
       </w:r>
     </w:p>
     <w:p>

</xml_diff>